<commit_message>
Auto-compile resume.pdf and resume.docx
</commit_message>
<xml_diff>
--- a/resume.docx
+++ b/resume.docx
@@ -127,14 +127,15 @@
         </w:r>
       </w:hyperlink>
     </w:p>
-    <w:bookmarkStart w:id="14" w:name="experience"/>
     <w:p>
       <w:pPr>
         <w:pStyle w:val="Heading1"/>
       </w:pPr>
+      <w:bookmarkStart w:id="14" w:name="_experience"/>
       <w:r>
         <w:t xml:space="preserve">Experience</w:t>
       </w:r>
+      <w:bookmarkEnd w:id="14"/>
     </w:p>
     <w:p>
       <w:pPr>
@@ -169,7 +170,7 @@
           <w:b/>
           <w:bCs/>
         </w:rPr>
-        <w:t xml:space="preserve">Applied Research Scientist</w:t>
+        <w:t xml:space="preserve">Applied Scientist</w:t>
       </w:r>
     </w:p>
     <w:p>
@@ -181,22 +182,24 @@
           <w:i/>
           <w:iCs/>
         </w:rPr>
-        <w:t xml:space="preserve">Thomson Reuters</w:t>
-      </w:r>
-    </w:p>
-    <w:p>
-      <w:pPr>
+        <w:t xml:space="preserve">Thomson Reuters (CoCounsel, AI legal assistant)</w:t>
+      </w:r>
+    </w:p>
+    <w:p>
+      <w:pPr>
+        <w:pStyle w:val="FirstParagraph"/>
         <w:numPr>
           <w:ilvl w:val="0"/>
           <w:numId w:val="1001"/>
         </w:numPr>
       </w:pPr>
       <w:r>
-        <w:t xml:space="preserve">Building agentic systems for CoCounsel, TR’s AI legal assistant, that extract risks across M&amp;A due diligence documents, working with lawyers to encode their methodologies, identifying 90%+ of material risks.</w:t>
-      </w:r>
-    </w:p>
-    <w:p>
-      <w:pPr>
+        <w:t xml:space="preserve">Built the agentic system for M&amp;A due-diligence review across hundreds of documents per deal, grounding LLM agents via tools in expert-curated sources (e.g., Practical Law); achieves 90%+ recall of lawyer-flagged material risks.</w:t>
+      </w:r>
+    </w:p>
+    <w:p>
+      <w:pPr>
+        <w:pStyle w:val="FirstParagraph"/>
         <w:numPr>
           <w:ilvl w:val="0"/>
           <w:numId w:val="1001"/>
@@ -208,6 +211,7 @@
     </w:p>
     <w:p>
       <w:pPr>
+        <w:pStyle w:val="FirstParagraph"/>
         <w:numPr>
           <w:ilvl w:val="0"/>
           <w:numId w:val="1001"/>
@@ -219,6 +223,7 @@
     </w:p>
     <w:p>
       <w:pPr>
+        <w:pStyle w:val="FirstParagraph"/>
         <w:numPr>
           <w:ilvl w:val="0"/>
           <w:numId w:val="1001"/>
@@ -230,6 +235,7 @@
     </w:p>
     <w:p>
       <w:pPr>
+        <w:pStyle w:val="FirstParagraph"/>
         <w:numPr>
           <w:ilvl w:val="0"/>
           <w:numId w:val="1001"/>
@@ -241,6 +247,7 @@
     </w:p>
     <w:p>
       <w:pPr>
+        <w:pStyle w:val="FirstParagraph"/>
         <w:numPr>
           <w:ilvl w:val="0"/>
           <w:numId w:val="1001"/>
@@ -300,6 +307,7 @@
     </w:p>
     <w:p>
       <w:pPr>
+        <w:pStyle w:val="FirstParagraph"/>
         <w:numPr>
           <w:ilvl w:val="0"/>
           <w:numId w:val="1002"/>
@@ -311,6 +319,7 @@
     </w:p>
     <w:p>
       <w:pPr>
+        <w:pStyle w:val="FirstParagraph"/>
         <w:numPr>
           <w:ilvl w:val="0"/>
           <w:numId w:val="1002"/>
@@ -370,6 +379,7 @@
     </w:p>
     <w:p>
       <w:pPr>
+        <w:pStyle w:val="FirstParagraph"/>
         <w:numPr>
           <w:ilvl w:val="0"/>
           <w:numId w:val="1003"/>
@@ -381,6 +391,7 @@
     </w:p>
     <w:p>
       <w:pPr>
+        <w:pStyle w:val="FirstParagraph"/>
         <w:numPr>
           <w:ilvl w:val="0"/>
           <w:numId w:val="1003"/>
@@ -390,15 +401,15 @@
         <w:t xml:space="preserve">Built diagnostic classifiers reaching 80% accuracy for Parkinson’s and 82% for Schizophrenia from EEG signals, and 92% for autism by representing gaze scanpaths as images and training a custom transfer-learning computer vision model.</w:t>
       </w:r>
     </w:p>
-    <w:bookmarkEnd w:id="14"/>
-    <w:bookmarkStart w:id="15" w:name="education"/>
     <w:p>
       <w:pPr>
         <w:pStyle w:val="Heading1"/>
       </w:pPr>
+      <w:bookmarkStart w:id="15" w:name="_education"/>
       <w:r>
         <w:t xml:space="preserve">Education</w:t>
       </w:r>
+      <w:bookmarkEnd w:id="15"/>
     </w:p>
     <w:p>
       <w:pPr>
@@ -578,15 +589,15 @@
         <w:t xml:space="preserve"> </w:t>
       </w:r>
     </w:p>
-    <w:bookmarkEnd w:id="15"/>
-    <w:bookmarkStart w:id="21" w:name="key-projects"/>
     <w:p>
       <w:pPr>
         <w:pStyle w:val="Heading1"/>
       </w:pPr>
+      <w:bookmarkStart w:id="16" w:name="_e33b7c282bb0229284f82c0d22ab8a178422dae"/>
       <w:r>
         <w:t xml:space="preserve">Key Projects</w:t>
       </w:r>
+      <w:bookmarkEnd w:id="16"/>
     </w:p>
     <w:p>
       <w:pPr>
@@ -602,7 +613,7 @@
       <w:r>
         <w:t xml:space="preserve"> </w:t>
       </w:r>
-      <w:hyperlink r:id="rId16">
+      <w:hyperlink r:id="rId17">
         <w:r>
           <w:rPr>
             <w:rStyle w:val="Hyperlink"/>
@@ -610,89 +621,6 @@
           <w:t xml:space="preserve">Website</w:t>
         </w:r>
       </w:hyperlink>
-      <w:r>
-        <w:t xml:space="preserve"> </w:t>
-      </w:r>
-      <w:hyperlink r:id="rId17">
-        <w:r>
-          <w:rPr>
-            <w:rStyle w:val="Hyperlink"/>
-          </w:rPr>
-          <w:t xml:space="preserve">Repo</w:t>
-        </w:r>
-      </w:hyperlink>
-    </w:p>
-    <w:p>
-      <w:pPr>
-        <w:numPr>
-          <w:ilvl w:val="0"/>
-          <w:numId w:val="1004"/>
-        </w:numPr>
-      </w:pPr>
-      <w:r>
-        <w:t xml:space="preserve">Designed a resource-efficient, transferable character emulation pipeline: fine-tuned a quantized LLaMA model with</w:t>
-      </w:r>
-      <w:r>
-        <w:t xml:space="preserve"> </w:t>
-      </w:r>
-      <w:r>
-        <w:rPr>
-          <w:i/>
-          <w:iCs/>
-        </w:rPr>
-        <w:t xml:space="preserve">LoRA</w:t>
-      </w:r>
-      <w:r>
-        <w:t xml:space="preserve"> </w:t>
-      </w:r>
-      <w:r>
-        <w:t xml:space="preserve">for Sherlock Holmes emulation, automating dialogue extraction and synthetic data generation from public domain texts.</w:t>
-      </w:r>
-    </w:p>
-    <w:p>
-      <w:pPr>
-        <w:numPr>
-          <w:ilvl w:val="0"/>
-          <w:numId w:val="1004"/>
-        </w:numPr>
-      </w:pPr>
-      <w:r>
-        <w:t xml:space="preserve">Implemented ReAct-style reasoning for multi-step deductive analysis with dual inference support (OpenRouter API and local GGUF), optimizing for performance and cost across cloud and local setups.</w:t>
-      </w:r>
-    </w:p>
-    <w:p>
-      <w:pPr>
-        <w:numPr>
-          <w:ilvl w:val="0"/>
-          <w:numId w:val="1004"/>
-        </w:numPr>
-      </w:pPr>
-      <w:r>
-        <w:t xml:space="preserve">Built an interactive story mode where users play as characters in branching Sherlock Holmes mysteries through structured decisions and free-form actions, using templated prompts with streaming structured output to deliver real-time scene generation and auto-generated context summaries.</w:t>
-      </w:r>
-    </w:p>
-    <w:p>
-      <w:pPr>
-        <w:numPr>
-          <w:ilvl w:val="0"/>
-          <w:numId w:val="1004"/>
-        </w:numPr>
-      </w:pPr>
-      <w:r>
-        <w:t xml:space="preserve">In A/B testing, 72.4% of users favoured the fine-tuned model over baseline for authenticity, with perfect usability scores.</w:t>
-      </w:r>
-    </w:p>
-    <w:p>
-      <w:pPr>
-        <w:pStyle w:val="FirstParagraph"/>
-      </w:pPr>
-      <w:r>
-        <w:rPr>
-          <w:b/>
-          <w:bCs/>
-        </w:rPr>
-        <w:t xml:space="preserve">CourseCompanion: RAG-Powered Course Assistant</w:t>
-      </w:r>
       <w:r>
         <w:t xml:space="preserve"> </w:t>
       </w:r>
@@ -707,6 +635,94 @@
     </w:p>
     <w:p>
       <w:pPr>
+        <w:pStyle w:val="FirstParagraph"/>
+        <w:numPr>
+          <w:ilvl w:val="0"/>
+          <w:numId w:val="1004"/>
+        </w:numPr>
+      </w:pPr>
+      <w:r>
+        <w:t xml:space="preserve">Designed a resource-efficient, transferable character emulation pipeline: fine-tuned a quantized LLaMA model with</w:t>
+      </w:r>
+      <w:r>
+        <w:t xml:space="preserve"> </w:t>
+      </w:r>
+      <w:r>
+        <w:rPr>
+          <w:i/>
+          <w:iCs/>
+        </w:rPr>
+        <w:t xml:space="preserve">LoRA</w:t>
+      </w:r>
+      <w:r>
+        <w:t xml:space="preserve"> </w:t>
+      </w:r>
+      <w:r>
+        <w:t xml:space="preserve">for Sherlock Holmes emulation, automating dialogue extraction and synthetic data generation from public domain texts.</w:t>
+      </w:r>
+    </w:p>
+    <w:p>
+      <w:pPr>
+        <w:pStyle w:val="FirstParagraph"/>
+        <w:numPr>
+          <w:ilvl w:val="0"/>
+          <w:numId w:val="1004"/>
+        </w:numPr>
+      </w:pPr>
+      <w:r>
+        <w:t xml:space="preserve">Implemented ReAct-style reasoning for multi-step deductive analysis with dual inference support (OpenRouter API and local GGUF), optimizing for performance and cost across cloud and local setups.</w:t>
+      </w:r>
+    </w:p>
+    <w:p>
+      <w:pPr>
+        <w:pStyle w:val="FirstParagraph"/>
+        <w:numPr>
+          <w:ilvl w:val="0"/>
+          <w:numId w:val="1004"/>
+        </w:numPr>
+      </w:pPr>
+      <w:r>
+        <w:t xml:space="preserve">Built an interactive story mode where users play as characters in branching Sherlock Holmes mysteries through structured decisions and free-form actions, using templated prompts with streaming structured output to deliver real-time scene generation and auto-generated context summaries.</w:t>
+      </w:r>
+    </w:p>
+    <w:p>
+      <w:pPr>
+        <w:pStyle w:val="FirstParagraph"/>
+        <w:numPr>
+          <w:ilvl w:val="0"/>
+          <w:numId w:val="1004"/>
+        </w:numPr>
+      </w:pPr>
+      <w:r>
+        <w:t xml:space="preserve">In A/B testing, 72.4% of users favoured the fine-tuned model over baseline for authenticity, with perfect usability scores.</w:t>
+      </w:r>
+    </w:p>
+    <w:p>
+      <w:pPr>
+        <w:pStyle w:val="FirstParagraph"/>
+      </w:pPr>
+      <w:r>
+        <w:rPr>
+          <w:b/>
+          <w:bCs/>
+        </w:rPr>
+        <w:t xml:space="preserve">CourseCompanion: RAG-Powered Course Assistant</w:t>
+      </w:r>
+      <w:r>
+        <w:t xml:space="preserve"> </w:t>
+      </w:r>
+      <w:hyperlink r:id="rId19">
+        <w:r>
+          <w:rPr>
+            <w:rStyle w:val="Hyperlink"/>
+          </w:rPr>
+          <w:t xml:space="preserve">Repo</w:t>
+        </w:r>
+      </w:hyperlink>
+    </w:p>
+    <w:p>
+      <w:pPr>
+        <w:pStyle w:val="FirstParagraph"/>
         <w:numPr>
           <w:ilvl w:val="0"/>
           <w:numId w:val="1005"/>
@@ -730,7 +746,7 @@
       <w:r>
         <w:t xml:space="preserve"> </w:t>
       </w:r>
-      <w:hyperlink r:id="rId19">
+      <w:hyperlink r:id="rId20">
         <w:r>
           <w:rPr>
             <w:rStyle w:val="Hyperlink"/>
@@ -741,7 +757,7 @@
       <w:r>
         <w:t xml:space="preserve"> </w:t>
       </w:r>
-      <w:hyperlink r:id="rId20">
+      <w:hyperlink r:id="rId21">
         <w:r>
           <w:rPr>
             <w:rStyle w:val="Hyperlink"/>
@@ -752,6 +768,7 @@
     </w:p>
     <w:p>
       <w:pPr>
+        <w:pStyle w:val="FirstParagraph"/>
         <w:numPr>
           <w:ilvl w:val="0"/>
           <w:numId w:val="1006"/>
@@ -761,15 +778,15 @@
         <w:t xml:space="preserve">Built a modular Flask web app for webcam-based eye-tracking data collection, visualization, real-time prediction, and model retraining, operationalizing the autism-detection method from my publication.</w:t>
       </w:r>
     </w:p>
-    <w:bookmarkEnd w:id="21"/>
-    <w:bookmarkStart w:id="23" w:name="publication"/>
     <w:p>
       <w:pPr>
         <w:pStyle w:val="Heading1"/>
       </w:pPr>
+      <w:bookmarkStart w:id="22" w:name="_publication"/>
       <w:r>
         <w:t xml:space="preserve">Publication</w:t>
       </w:r>
+      <w:bookmarkEnd w:id="22"/>
     </w:p>
     <w:p>
       <w:pPr>
@@ -801,17 +818,17 @@
       <w:r>
         <w:t xml:space="preserve"> </w:t>
       </w:r>
-      <w:hyperlink r:id="rId22"/>
-    </w:p>
-    <w:bookmarkEnd w:id="23"/>
-    <w:bookmarkStart w:id="24" w:name="technical-skills"/>
+      <w:hyperlink r:id="rId23"/>
+    </w:p>
     <w:p>
       <w:pPr>
         <w:pStyle w:val="Heading1"/>
       </w:pPr>
+      <w:bookmarkStart w:id="24" w:name="_74cbeae4f9bcf682d04a3a1ec3f8c226bc62f5b"/>
       <w:r>
         <w:t xml:space="preserve">Technical Skills</w:t>
       </w:r>
+      <w:bookmarkEnd w:id="24"/>
     </w:p>
     <w:p>
       <w:pPr>
@@ -873,7 +890,6 @@
         <w:t xml:space="preserve">Spark/Databricks, PostgreSQL, Pinecone, Runpod, DigitalOcean, MCP, Agent Harness Design, Claude Code, Cursor</w:t>
       </w:r>
     </w:p>
-    <w:bookmarkEnd w:id="24"/>
     <w:sectPr>
       <w:footnotePr>
         <w:numRestart w:val="eachSect"/>
@@ -1116,10 +1132,10 @@
   <w:docDefaults>
     <w:rPrDefault>
       <w:rPr>
-        <w:rFonts w:asciiTheme="minorHAnsi" w:cstheme="minorBidi" w:eastAsiaTheme="minorEastAsia" w:hAnsiTheme="minorHAnsi"/>
+        <w:rFonts w:asciiTheme="minorHAnsi" w:eastAsiaTheme="minorEastAsia" w:hAnsiTheme="minorHAnsi" w:cstheme="minorBidi"/>
         <w:sz w:val="24"/>
         <w:szCs w:val="24"/>
-        <w:lang w:bidi="ar-SA" w:eastAsia="zh-CN" w:val="en-US"/>
+        <w:lang w:val="en-US" w:eastAsia="zh-CN" w:bidi="ar-SA"/>
       </w:rPr>
     </w:rPrDefault>
     <w:pPrDefault>
@@ -1128,35 +1144,35 @@
       </w:pPr>
     </w:pPrDefault>
   </w:docDefaults>
-  <w:latentStyles w:count="276" w:defLockedState="0" w:defQFormat="0" w:defSemiHidden="0" w:defUIPriority="0" w:defUnhideWhenUsed="0"/>
-  <w:style w:default="1" w:styleId="Normal" w:type="paragraph">
+  <w:latentStyles w:defLockedState="0" w:defUIPriority="0" w:defSemiHidden="0" w:defUnhideWhenUsed="0" w:defQFormat="0" w:count="276"/>
+  <w:style w:type="paragraph" w:default="1" w:styleId="Normal">
     <w:name w:val="Normal"/>
     <w:qFormat/>
   </w:style>
-  <w:style w:styleId="BodyText" w:type="paragraph">
+  <w:style w:type="paragraph" w:styleId="BodyText">
     <w:name w:val="Body Text"/>
     <w:basedOn w:val="Normal"/>
     <w:link w:val="BodyTextChar"/>
     <w:qFormat/>
     <w:pPr>
-      <w:spacing w:after="180" w:before="180"/>
-    </w:pPr>
-  </w:style>
-  <w:style w:customStyle="1" w:styleId="FirstParagraph" w:type="paragraph">
+      <w:spacing w:before="180" w:after="180"/>
+    </w:pPr>
+  </w:style>
+  <w:style w:type="paragraph" w:customStyle="1" w:styleId="FirstParagraph">
     <w:name w:val="First Paragraph"/>
     <w:basedOn w:val="BodyText"/>
     <w:next w:val="BodyText"/>
     <w:qFormat/>
   </w:style>
-  <w:style w:customStyle="1" w:styleId="Compact" w:type="paragraph">
+  <w:style w:type="paragraph" w:customStyle="1" w:styleId="Compact">
     <w:name w:val="Compact"/>
     <w:basedOn w:val="BodyText"/>
     <w:qFormat/>
     <w:pPr>
-      <w:spacing w:after="36" w:before="36"/>
-    </w:pPr>
-  </w:style>
-  <w:style w:styleId="Title" w:type="paragraph">
+      <w:spacing w:before="36" w:after="36"/>
+    </w:pPr>
+  </w:style>
+  <w:style w:type="paragraph" w:styleId="Title">
     <w:name w:val="Title"/>
     <w:basedOn w:val="Normal"/>
     <w:next w:val="BodyText"/>
@@ -1170,24 +1186,24 @@
       <w:jc w:val="center"/>
     </w:pPr>
     <w:rPr>
-      <w:rFonts w:asciiTheme="majorHAnsi" w:cstheme="majorBidi" w:eastAsiaTheme="majorEastAsia" w:hAnsiTheme="majorHAnsi"/>
+      <w:rFonts w:asciiTheme="majorHAnsi" w:eastAsiaTheme="majorEastAsia" w:hAnsiTheme="majorHAnsi" w:cstheme="majorBidi"/>
       <w:sz w:val="56"/>
       <w:szCs w:val="56"/>
     </w:rPr>
   </w:style>
-  <w:style w:customStyle="1" w:styleId="TitleChar" w:type="character">
+  <w:style w:type="character" w:customStyle="1" w:styleId="TitleChar">
     <w:name w:val="Title Char"/>
     <w:basedOn w:val="DefaultParagraphFont"/>
     <w:link w:val="Title"/>
     <w:uiPriority w:val="10"/>
     <w:rsid w:val="00A10FD9"/>
     <w:rPr>
-      <w:rFonts w:asciiTheme="majorHAnsi" w:cstheme="majorBidi" w:eastAsiaTheme="majorEastAsia" w:hAnsiTheme="majorHAnsi"/>
+      <w:rFonts w:asciiTheme="majorHAnsi" w:eastAsiaTheme="majorEastAsia" w:hAnsiTheme="majorHAnsi" w:cstheme="majorBidi"/>
       <w:sz w:val="56"/>
       <w:szCs w:val="56"/>
     </w:rPr>
   </w:style>
-  <w:style w:styleId="Subtitle" w:type="paragraph">
+  <w:style w:type="paragraph" w:styleId="Subtitle">
     <w:name w:val="Subtitle"/>
     <w:basedOn w:val="Title"/>
     <w:next w:val="BodyText"/>
@@ -1201,27 +1217,27 @@
       </w:numPr>
     </w:pPr>
     <w:rPr>
-      <w:rFonts w:cstheme="majorBidi" w:eastAsiaTheme="majorEastAsia"/>
+      <w:rFonts w:eastAsiaTheme="majorEastAsia" w:cstheme="majorBidi"/>
       <w:spacing w:val="15"/>
       <w:sz w:val="28"/>
       <w:szCs w:val="28"/>
     </w:rPr>
   </w:style>
-  <w:style w:customStyle="1" w:styleId="SubtitleChar" w:type="character">
+  <w:style w:type="character" w:customStyle="1" w:styleId="SubtitleChar">
     <w:name w:val="Subtitle Char"/>
     <w:basedOn w:val="DefaultParagraphFont"/>
     <w:link w:val="Subtitle"/>
     <w:uiPriority w:val="11"/>
     <w:rsid w:val="00A10FD9"/>
     <w:rPr>
-      <w:rFonts w:cstheme="majorBidi" w:eastAsiaTheme="majorEastAsia"/>
-      <w:color w:themeColor="text1" w:themeTint="A6" w:val="595959"/>
+      <w:rFonts w:eastAsiaTheme="majorEastAsia" w:cstheme="majorBidi"/>
+      <w:color w:val="595959" w:themeColor="text1" w:themeTint="A6"/>
       <w:spacing w:val="15"/>
       <w:sz w:val="28"/>
       <w:szCs w:val="28"/>
     </w:rPr>
   </w:style>
-  <w:style w:customStyle="1" w:styleId="Author" w:type="paragraph">
+  <w:style w:type="paragraph" w:customStyle="1" w:styleId="Author">
     <w:name w:val="Author"/>
     <w:basedOn w:val="Title"/>
     <w:next w:val="BodyText"/>
@@ -1235,7 +1251,7 @@
       <w:szCs w:val="24"/>
     </w:rPr>
   </w:style>
-  <w:style w:styleId="Date" w:type="paragraph">
+  <w:style w:type="paragraph" w:styleId="Date">
     <w:name w:val="Date"/>
     <w:basedOn w:val="Title"/>
     <w:next w:val="BodyText"/>
@@ -1249,7 +1265,7 @@
       <w:szCs w:val="24"/>
     </w:rPr>
   </w:style>
-  <w:style w:customStyle="1" w:styleId="AbstractTitle" w:type="paragraph">
+  <w:style w:type="paragraph" w:customStyle="1" w:styleId="AbstractTitle">
     <w:name w:val="Abstract Title"/>
     <w:basedOn w:val="Normal"/>
     <w:next w:val="Abstract"/>
@@ -1257,7 +1273,7 @@
     <w:pPr>
       <w:keepNext/>
       <w:keepLines/>
-      <w:spacing w:after="0" w:before="300"/>
+      <w:spacing w:before="300" w:after="0"/>
       <w:jc w:val="center"/>
     </w:pPr>
     <w:rPr>
@@ -1266,7 +1282,7 @@
       <w:szCs w:val="20"/>
     </w:rPr>
   </w:style>
-  <w:style w:customStyle="1" w:styleId="Abstract" w:type="paragraph">
+  <w:style w:type="paragraph" w:customStyle="1" w:styleId="Abstract">
     <w:name w:val="Abstract"/>
     <w:basedOn w:val="Normal"/>
     <w:next w:val="BodyText"/>
@@ -1274,14 +1290,14 @@
     <w:pPr>
       <w:keepNext/>
       <w:keepLines/>
-      <w:spacing w:after="300" w:before="100"/>
+      <w:spacing w:before="100" w:after="300"/>
     </w:pPr>
     <w:rPr>
       <w:sz w:val="20"/>
       <w:szCs w:val="20"/>
     </w:rPr>
   </w:style>
-  <w:style w:styleId="Bibliography" w:type="paragraph">
+  <w:style w:type="paragraph" w:styleId="Bibliography">
     <w:name w:val="Bibliography"/>
     <w:basedOn w:val="Normal"/>
     <w:next w:val="Bibliography"/>
@@ -1289,7 +1305,7 @@
     <w:pPr/>
     <w:rPr/>
   </w:style>
-  <w:style w:styleId="Heading1" w:type="paragraph">
+  <w:style w:type="paragraph" w:styleId="Heading1">
     <w:name w:val="heading 1"/>
     <w:basedOn w:val="Normal"/>
     <w:next w:val="BodyText"/>
@@ -1300,17 +1316,17 @@
     <w:pPr>
       <w:keepNext/>
       <w:keepLines/>
-      <w:spacing w:after="80" w:before="360"/>
+      <w:spacing w:before="360" w:after="80"/>
       <w:outlineLvl w:val="0"/>
     </w:pPr>
     <w:rPr>
-      <w:rFonts w:asciiTheme="majorHAnsi" w:cstheme="majorBidi" w:eastAsiaTheme="majorEastAsia" w:hAnsiTheme="majorHAnsi"/>
-      <w:color w:themeColor="accent1" w:themeShade="BF" w:val="0F4761"/>
+      <w:rFonts w:asciiTheme="majorHAnsi" w:eastAsiaTheme="majorEastAsia" w:hAnsiTheme="majorHAnsi" w:cstheme="majorBidi"/>
+      <w:color w:val="0F4761" w:themeColor="accent1" w:themeShade="BF"/>
       <w:sz w:val="40"/>
       <w:szCs w:val="40"/>
     </w:rPr>
   </w:style>
-  <w:style w:styleId="Heading2" w:type="paragraph">
+  <w:style w:type="paragraph" w:styleId="Heading2">
     <w:name w:val="heading 2"/>
     <w:basedOn w:val="Normal"/>
     <w:next w:val="BodyText"/>
@@ -1323,17 +1339,17 @@
     <w:pPr>
       <w:keepNext/>
       <w:keepLines/>
-      <w:spacing w:after="80" w:before="160"/>
+      <w:spacing w:before="160" w:after="80"/>
       <w:outlineLvl w:val="1"/>
     </w:pPr>
     <w:rPr>
-      <w:rFonts w:asciiTheme="majorHAnsi" w:cstheme="majorBidi" w:eastAsiaTheme="majorEastAsia" w:hAnsiTheme="majorHAnsi"/>
-      <w:color w:themeColor="accent1" w:themeShade="BF" w:val="0F4761"/>
+      <w:rFonts w:asciiTheme="majorHAnsi" w:eastAsiaTheme="majorEastAsia" w:hAnsiTheme="majorHAnsi" w:cstheme="majorBidi"/>
+      <w:color w:val="0F4761" w:themeColor="accent1" w:themeShade="BF"/>
       <w:sz w:val="32"/>
       <w:szCs w:val="32"/>
     </w:rPr>
   </w:style>
-  <w:style w:styleId="Heading3" w:type="paragraph">
+  <w:style w:type="paragraph" w:styleId="Heading3">
     <w:name w:val="heading 3"/>
     <w:basedOn w:val="Normal"/>
     <w:next w:val="BodyText"/>
@@ -1346,17 +1362,17 @@
     <w:pPr>
       <w:keepNext/>
       <w:keepLines/>
-      <w:spacing w:after="80" w:before="160"/>
+      <w:spacing w:before="160" w:after="80"/>
       <w:outlineLvl w:val="2"/>
     </w:pPr>
     <w:rPr>
-      <w:rFonts w:cstheme="majorBidi" w:eastAsiaTheme="majorEastAsia"/>
-      <w:color w:themeColor="accent1" w:themeShade="BF" w:val="0F4761"/>
+      <w:rFonts w:eastAsiaTheme="majorEastAsia" w:cstheme="majorBidi"/>
+      <w:color w:val="0F4761" w:themeColor="accent1" w:themeShade="BF"/>
       <w:sz w:val="28"/>
       <w:szCs w:val="28"/>
     </w:rPr>
   </w:style>
-  <w:style w:styleId="Heading4" w:type="paragraph">
+  <w:style w:type="paragraph" w:styleId="Heading4">
     <w:name w:val="heading 4"/>
     <w:basedOn w:val="Normal"/>
     <w:next w:val="BodyText"/>
@@ -1369,17 +1385,17 @@
     <w:pPr>
       <w:keepNext/>
       <w:keepLines/>
-      <w:spacing w:after="40" w:before="80"/>
+      <w:spacing w:before="80" w:after="40"/>
       <w:outlineLvl w:val="3"/>
     </w:pPr>
     <w:rPr>
-      <w:rFonts w:cstheme="majorBidi" w:eastAsiaTheme="majorEastAsia"/>
+      <w:rFonts w:eastAsiaTheme="majorEastAsia" w:cstheme="majorBidi"/>
       <w:i/>
       <w:iCs/>
-      <w:color w:themeColor="accent1" w:themeShade="BF" w:val="0F4761"/>
-    </w:rPr>
-  </w:style>
-  <w:style w:styleId="Heading5" w:type="paragraph">
+      <w:color w:val="0F4761" w:themeColor="accent1" w:themeShade="BF"/>
+    </w:rPr>
+  </w:style>
+  <w:style w:type="paragraph" w:styleId="Heading5">
     <w:name w:val="heading 5"/>
     <w:basedOn w:val="Normal"/>
     <w:next w:val="BodyText"/>
@@ -1392,15 +1408,15 @@
     <w:pPr>
       <w:keepNext/>
       <w:keepLines/>
-      <w:spacing w:after="40" w:before="80"/>
+      <w:spacing w:before="80" w:after="40"/>
       <w:outlineLvl w:val="4"/>
     </w:pPr>
     <w:rPr>
-      <w:rFonts w:cstheme="majorBidi" w:eastAsiaTheme="majorEastAsia"/>
-      <w:color w:themeColor="accent1" w:themeShade="BF" w:val="0F4761"/>
-    </w:rPr>
-  </w:style>
-  <w:style w:styleId="Heading6" w:type="paragraph">
+      <w:rFonts w:eastAsiaTheme="majorEastAsia" w:cstheme="majorBidi"/>
+      <w:color w:val="0F4761" w:themeColor="accent1" w:themeShade="BF"/>
+    </w:rPr>
+  </w:style>
+  <w:style w:type="paragraph" w:styleId="Heading6">
     <w:name w:val="heading 6"/>
     <w:basedOn w:val="Normal"/>
     <w:next w:val="BodyText"/>
@@ -1413,17 +1429,17 @@
     <w:pPr>
       <w:keepNext/>
       <w:keepLines/>
-      <w:spacing w:after="0" w:before="40"/>
+      <w:spacing w:before="40" w:after="0"/>
       <w:outlineLvl w:val="5"/>
     </w:pPr>
     <w:rPr>
-      <w:rFonts w:cstheme="majorBidi" w:eastAsiaTheme="majorEastAsia"/>
+      <w:rFonts w:eastAsiaTheme="majorEastAsia" w:cstheme="majorBidi"/>
       <w:i/>
       <w:iCs/>
-      <w:color w:themeColor="text1" w:themeTint="A6" w:val="595959"/>
-    </w:rPr>
-  </w:style>
-  <w:style w:styleId="Heading7" w:type="paragraph">
+      <w:color w:val="595959" w:themeColor="text1" w:themeTint="A6"/>
+    </w:rPr>
+  </w:style>
+  <w:style w:type="paragraph" w:styleId="Heading7">
     <w:name w:val="heading 7"/>
     <w:basedOn w:val="Normal"/>
     <w:next w:val="BodyText"/>
@@ -1436,15 +1452,15 @@
     <w:pPr>
       <w:keepNext/>
       <w:keepLines/>
-      <w:spacing w:after="0" w:before="40"/>
+      <w:spacing w:before="40" w:after="0"/>
       <w:outlineLvl w:val="6"/>
     </w:pPr>
     <w:rPr>
-      <w:rFonts w:cstheme="majorBidi" w:eastAsiaTheme="majorEastAsia"/>
-      <w:color w:themeColor="text1" w:themeTint="A6" w:val="595959"/>
-    </w:rPr>
-  </w:style>
-  <w:style w:styleId="Heading8" w:type="paragraph">
+      <w:rFonts w:eastAsiaTheme="majorEastAsia" w:cstheme="majorBidi"/>
+      <w:color w:val="595959" w:themeColor="text1" w:themeTint="A6"/>
+    </w:rPr>
+  </w:style>
+  <w:style w:type="paragraph" w:styleId="Heading8">
     <w:name w:val="heading 8"/>
     <w:basedOn w:val="Normal"/>
     <w:next w:val="BodyText"/>
@@ -1461,13 +1477,13 @@
       <w:outlineLvl w:val="7"/>
     </w:pPr>
     <w:rPr>
-      <w:rFonts w:cstheme="majorBidi" w:eastAsiaTheme="majorEastAsia"/>
+      <w:rFonts w:eastAsiaTheme="majorEastAsia" w:cstheme="majorBidi"/>
       <w:i/>
       <w:iCs/>
-      <w:color w:themeColor="text1" w:themeTint="D8" w:val="272727"/>
-    </w:rPr>
-  </w:style>
-  <w:style w:styleId="Heading9" w:type="paragraph">
+      <w:color w:val="272727" w:themeColor="text1" w:themeTint="D8"/>
+    </w:rPr>
+  </w:style>
+  <w:style w:type="paragraph" w:styleId="Heading9">
     <w:name w:val="heading 9"/>
     <w:basedOn w:val="Normal"/>
     <w:next w:val="BodyText"/>
@@ -1484,24 +1500,24 @@
       <w:outlineLvl w:val="8"/>
     </w:pPr>
     <w:rPr>
-      <w:rFonts w:cstheme="majorBidi" w:eastAsiaTheme="majorEastAsia"/>
-      <w:color w:themeColor="text1" w:themeTint="D8" w:val="272727"/>
-    </w:rPr>
-  </w:style>
-  <w:style w:customStyle="1" w:styleId="Heading1Char" w:type="character">
+      <w:rFonts w:eastAsiaTheme="majorEastAsia" w:cstheme="majorBidi"/>
+      <w:color w:val="272727" w:themeColor="text1" w:themeTint="D8"/>
+    </w:rPr>
+  </w:style>
+  <w:style w:type="character" w:customStyle="1" w:styleId="Heading1Char">
     <w:name w:val="Heading 1 Char"/>
     <w:basedOn w:val="DefaultParagraphFont"/>
     <w:link w:val="Heading1"/>
     <w:uiPriority w:val="9"/>
     <w:rsid w:val="00A10FD9"/>
     <w:rPr>
-      <w:rFonts w:asciiTheme="majorHAnsi" w:cstheme="majorBidi" w:eastAsiaTheme="majorEastAsia" w:hAnsiTheme="majorHAnsi"/>
-      <w:color w:themeColor="accent1" w:themeShade="BF" w:val="0F4761"/>
+      <w:rFonts w:asciiTheme="majorHAnsi" w:eastAsiaTheme="majorEastAsia" w:hAnsiTheme="majorHAnsi" w:cstheme="majorBidi"/>
+      <w:color w:val="0F4761" w:themeColor="accent1" w:themeShade="BF"/>
       <w:sz w:val="40"/>
       <w:szCs w:val="40"/>
     </w:rPr>
   </w:style>
-  <w:style w:customStyle="1" w:styleId="Heading2Char" w:type="character">
+  <w:style w:type="character" w:customStyle="1" w:styleId="Heading2Char">
     <w:name w:val="Heading 2 Char"/>
     <w:basedOn w:val="DefaultParagraphFont"/>
     <w:link w:val="Heading2"/>
@@ -1509,13 +1525,13 @@
     <w:semiHidden/>
     <w:rsid w:val="00A10FD9"/>
     <w:rPr>
-      <w:rFonts w:asciiTheme="majorHAnsi" w:cstheme="majorBidi" w:eastAsiaTheme="majorEastAsia" w:hAnsiTheme="majorHAnsi"/>
-      <w:color w:themeColor="accent1" w:themeShade="BF" w:val="0F4761"/>
+      <w:rFonts w:asciiTheme="majorHAnsi" w:eastAsiaTheme="majorEastAsia" w:hAnsiTheme="majorHAnsi" w:cstheme="majorBidi"/>
+      <w:color w:val="0F4761" w:themeColor="accent1" w:themeShade="BF"/>
       <w:sz w:val="32"/>
       <w:szCs w:val="32"/>
     </w:rPr>
   </w:style>
-  <w:style w:customStyle="1" w:styleId="Heading3Char" w:type="character">
+  <w:style w:type="character" w:customStyle="1" w:styleId="Heading3Char">
     <w:name w:val="Heading 3 Char"/>
     <w:basedOn w:val="DefaultParagraphFont"/>
     <w:link w:val="Heading3"/>
@@ -1523,13 +1539,13 @@
     <w:semiHidden/>
     <w:rsid w:val="00A10FD9"/>
     <w:rPr>
-      <w:rFonts w:cstheme="majorBidi" w:eastAsiaTheme="majorEastAsia"/>
-      <w:color w:themeColor="accent1" w:themeShade="BF" w:val="0F4761"/>
+      <w:rFonts w:eastAsiaTheme="majorEastAsia" w:cstheme="majorBidi"/>
+      <w:color w:val="0F4761" w:themeColor="accent1" w:themeShade="BF"/>
       <w:sz w:val="28"/>
       <w:szCs w:val="28"/>
     </w:rPr>
   </w:style>
-  <w:style w:customStyle="1" w:styleId="Heading4Char" w:type="character">
+  <w:style w:type="character" w:customStyle="1" w:styleId="Heading4Char">
     <w:name w:val="Heading 4 Char"/>
     <w:basedOn w:val="DefaultParagraphFont"/>
     <w:link w:val="Heading4"/>
@@ -1537,13 +1553,13 @@
     <w:semiHidden/>
     <w:rsid w:val="00A10FD9"/>
     <w:rPr>
-      <w:rFonts w:cstheme="majorBidi" w:eastAsiaTheme="majorEastAsia"/>
+      <w:rFonts w:eastAsiaTheme="majorEastAsia" w:cstheme="majorBidi"/>
       <w:i/>
       <w:iCs/>
-      <w:color w:themeColor="accent1" w:themeShade="BF" w:val="0F4761"/>
-    </w:rPr>
-  </w:style>
-  <w:style w:customStyle="1" w:styleId="Heading5Char" w:type="character">
+      <w:color w:val="0F4761" w:themeColor="accent1" w:themeShade="BF"/>
+    </w:rPr>
+  </w:style>
+  <w:style w:type="character" w:customStyle="1" w:styleId="Heading5Char">
     <w:name w:val="Heading 5 Char"/>
     <w:basedOn w:val="DefaultParagraphFont"/>
     <w:link w:val="Heading5"/>
@@ -1551,11 +1567,11 @@
     <w:semiHidden/>
     <w:rsid w:val="00A10FD9"/>
     <w:rPr>
-      <w:rFonts w:cstheme="majorBidi" w:eastAsiaTheme="majorEastAsia"/>
-      <w:color w:themeColor="accent1" w:themeShade="BF" w:val="0F4761"/>
-    </w:rPr>
-  </w:style>
-  <w:style w:customStyle="1" w:styleId="Heading6Char" w:type="character">
+      <w:rFonts w:eastAsiaTheme="majorEastAsia" w:cstheme="majorBidi"/>
+      <w:color w:val="0F4761" w:themeColor="accent1" w:themeShade="BF"/>
+    </w:rPr>
+  </w:style>
+  <w:style w:type="character" w:customStyle="1" w:styleId="Heading6Char">
     <w:name w:val="Heading 6 Char"/>
     <w:basedOn w:val="DefaultParagraphFont"/>
     <w:link w:val="Heading6"/>
@@ -1563,13 +1579,13 @@
     <w:semiHidden/>
     <w:rsid w:val="00A10FD9"/>
     <w:rPr>
-      <w:rFonts w:cstheme="majorBidi" w:eastAsiaTheme="majorEastAsia"/>
+      <w:rFonts w:eastAsiaTheme="majorEastAsia" w:cstheme="majorBidi"/>
       <w:i/>
       <w:iCs/>
-      <w:color w:themeColor="text1" w:themeTint="A6" w:val="595959"/>
-    </w:rPr>
-  </w:style>
-  <w:style w:customStyle="1" w:styleId="Heading7Char" w:type="character">
+      <w:color w:val="595959" w:themeColor="text1" w:themeTint="A6"/>
+    </w:rPr>
+  </w:style>
+  <w:style w:type="character" w:customStyle="1" w:styleId="Heading7Char">
     <w:name w:val="Heading 7 Char"/>
     <w:basedOn w:val="DefaultParagraphFont"/>
     <w:link w:val="Heading7"/>
@@ -1577,11 +1593,11 @@
     <w:semiHidden/>
     <w:rsid w:val="00A10FD9"/>
     <w:rPr>
-      <w:rFonts w:cstheme="majorBidi" w:eastAsiaTheme="majorEastAsia"/>
-      <w:color w:themeColor="text1" w:themeTint="A6" w:val="595959"/>
-    </w:rPr>
-  </w:style>
-  <w:style w:customStyle="1" w:styleId="Heading8Char" w:type="character">
+      <w:rFonts w:eastAsiaTheme="majorEastAsia" w:cstheme="majorBidi"/>
+      <w:color w:val="595959" w:themeColor="text1" w:themeTint="A6"/>
+    </w:rPr>
+  </w:style>
+  <w:style w:type="character" w:customStyle="1" w:styleId="Heading8Char">
     <w:name w:val="Heading 8 Char"/>
     <w:basedOn w:val="DefaultParagraphFont"/>
     <w:link w:val="Heading8"/>
@@ -1589,13 +1605,13 @@
     <w:semiHidden/>
     <w:rsid w:val="00A10FD9"/>
     <w:rPr>
-      <w:rFonts w:cstheme="majorBidi" w:eastAsiaTheme="majorEastAsia"/>
+      <w:rFonts w:eastAsiaTheme="majorEastAsia" w:cstheme="majorBidi"/>
       <w:i/>
       <w:iCs/>
-      <w:color w:themeColor="text1" w:themeTint="D8" w:val="272727"/>
-    </w:rPr>
-  </w:style>
-  <w:style w:customStyle="1" w:styleId="Heading9Char" w:type="character">
+      <w:color w:val="272727" w:themeColor="text1" w:themeTint="D8"/>
+    </w:rPr>
+  </w:style>
+  <w:style w:type="character" w:customStyle="1" w:styleId="Heading9Char">
     <w:name w:val="Heading 9 Char"/>
     <w:basedOn w:val="DefaultParagraphFont"/>
     <w:link w:val="Heading9"/>
@@ -1603,11 +1619,11 @@
     <w:semiHidden/>
     <w:rsid w:val="00A10FD9"/>
     <w:rPr>
-      <w:rFonts w:cstheme="majorBidi" w:eastAsiaTheme="majorEastAsia"/>
-      <w:color w:themeColor="text1" w:themeTint="D8" w:val="272727"/>
-    </w:rPr>
-  </w:style>
-  <w:style w:styleId="BlockText" w:type="paragraph">
+      <w:rFonts w:eastAsiaTheme="majorEastAsia" w:cstheme="majorBidi"/>
+      <w:color w:val="272727" w:themeColor="text1" w:themeTint="D8"/>
+    </w:rPr>
+  </w:style>
+  <w:style w:type="paragraph" w:styleId="BlockText">
     <w:name w:val="Block Text"/>
     <w:basedOn w:val="BodyText"/>
     <w:next w:val="BodyText"/>
@@ -1615,11 +1631,11 @@
     <w:unhideWhenUsed/>
     <w:qFormat/>
     <w:pPr>
-      <w:spacing w:after="100" w:before="100"/>
+      <w:spacing w:before="100" w:after="100"/>
       <w:ind w:firstLine="0" w:left="480" w:right="480"/>
     </w:pPr>
   </w:style>
-  <w:style w:styleId="FootnoteText" w:type="paragraph">
+  <w:style w:type="paragraph" w:styleId="FootnoteText">
     <w:name w:val="Footnote Text"/>
     <w:basedOn w:val="Normal"/>
     <w:next w:val="FootnoteText"/>
@@ -1627,7 +1643,7 @@
     <w:unhideWhenUsed/>
     <w:qFormat/>
   </w:style>
-  <w:style w:styleId="FootnoteBlockText" w:type="paragraph">
+  <w:style w:type="paragraph" w:styleId="FootnoteBlockText">
     <w:name w:val="Footnote Block Text"/>
     <w:basedOn w:val="FootnoteText"/>
     <w:next w:val="FootnoteText"/>
@@ -1635,28 +1651,26 @@
     <w:unhideWhenUsed/>
     <w:qFormat/>
     <w:pPr>
-      <w:spacing w:after="100" w:before="100"/>
+      <w:spacing w:before="100" w:after="100"/>
       <w:ind w:firstLine="0" w:left="480" w:right="480"/>
     </w:pPr>
   </w:style>
-  <w:style w:default="1" w:styleId="DefaultParagraphFont" w:type="character">
+  <w:style w:type="character" w:default="1" w:styleId="DefaultParagraphFont">
     <w:name w:val="Default Paragraph Font"/>
     <w:semiHidden/>
     <w:unhideWhenUsed/>
   </w:style>
-  <w:style w:default="1" w:styleId="Table" w:type="table">
+  <w:style w:type="table" w:default="1" w:styleId="Table">
     <w:name w:val="Table"/>
     <w:basedOn w:val="TableNormal"/>
-    <w:semiHidden/>
-    <w:unhideWhenUsed/>
     <w:qFormat/>
     <w:tblPr>
-      <w:tblInd w:type="dxa" w:w="0"/>
+      <w:tblInd w:w="0" w:type="dxa"/>
       <w:tblCellMar>
-        <w:top w:type="dxa" w:w="0"/>
-        <w:left w:type="dxa" w:w="108"/>
-        <w:bottom w:type="dxa" w:w="0"/>
-        <w:right w:type="dxa" w:w="108"/>
+        <w:top w:w="0" w:type="dxa"/>
+        <w:left w:w="108" w:type="dxa"/>
+        <w:bottom w:w="0" w:type="dxa"/>
+        <w:right w:w="108" w:type="dxa"/>
       </w:tblCellMar>
     </w:tblPr>
     <w:tblStylePr w:type="firstRow">
@@ -1668,7 +1682,7 @@
       </w:tcPr>
     </w:tblStylePr>
   </w:style>
-  <w:style w:customStyle="1" w:styleId="DefinitionTerm" w:type="paragraph">
+  <w:style w:type="paragraph" w:customStyle="1" w:styleId="DefinitionTerm">
     <w:name w:val="Definition Term"/>
     <w:basedOn w:val="Normal"/>
     <w:next w:val="Definition"/>
@@ -1681,49 +1695,49 @@
       <w:b/>
     </w:rPr>
   </w:style>
-  <w:style w:customStyle="1" w:styleId="Definition" w:type="paragraph">
+  <w:style w:type="paragraph" w:customStyle="1" w:styleId="Definition">
     <w:name w:val="Definition"/>
     <w:basedOn w:val="Normal"/>
   </w:style>
-  <w:style w:styleId="Caption" w:type="paragraph">
+  <w:style w:type="paragraph" w:styleId="Caption">
     <w:name w:val="Caption"/>
     <w:basedOn w:val="Normal"/>
     <w:link w:val="BodyTextChar"/>
     <w:pPr>
-      <w:spacing w:after="120" w:before="0"/>
+      <w:spacing w:before="0" w:after="120"/>
     </w:pPr>
     <w:rPr>
       <w:i/>
     </w:rPr>
   </w:style>
-  <w:style w:customStyle="1" w:styleId="TableCaption" w:type="paragraph">
+  <w:style w:type="paragraph" w:customStyle="1" w:styleId="TableCaption">
     <w:name w:val="Table Caption"/>
     <w:basedOn w:val="Caption"/>
     <w:pPr>
       <w:keepNext/>
     </w:pPr>
   </w:style>
-  <w:style w:customStyle="1" w:styleId="ImageCaption" w:type="paragraph">
+  <w:style w:type="paragraph" w:customStyle="1" w:styleId="ImageCaption">
     <w:name w:val="Image Caption"/>
     <w:basedOn w:val="Caption"/>
   </w:style>
-  <w:style w:customStyle="1" w:styleId="Figure" w:type="paragraph">
+  <w:style w:type="paragraph" w:customStyle="1" w:styleId="Figure">
     <w:name w:val="Figure"/>
     <w:basedOn w:val="Normal"/>
   </w:style>
-  <w:style w:customStyle="1" w:styleId="CaptionedFigure" w:type="paragraph">
+  <w:style w:type="paragraph" w:customStyle="1" w:styleId="CaptionedFigure">
     <w:name w:val="Captioned Figure"/>
     <w:basedOn w:val="Figure"/>
     <w:pPr>
       <w:keepNext/>
     </w:pPr>
   </w:style>
-  <w:style w:customStyle="1" w:styleId="BodyTextChar" w:type="character">
+  <w:style w:type="character" w:customStyle="1" w:styleId="BodyTextChar">
     <w:name w:val="Body Text Char"/>
     <w:basedOn w:val="DefaultParagraphFont"/>
     <w:link w:val="BodyText"/>
   </w:style>
-  <w:style w:customStyle="1" w:styleId="VerbatimChar" w:type="character">
+  <w:style w:type="character" w:customStyle="1" w:styleId="VerbatimChar">
     <w:name w:val="Verbatim Char"/>
     <w:basedOn w:val="BodyTextChar"/>
     <w:rPr>
@@ -1731,25 +1745,25 @@
       <w:sz w:val="22"/>
     </w:rPr>
   </w:style>
-  <w:style w:customStyle="1" w:styleId="SectionNumber" w:type="character">
+  <w:style w:type="character" w:customStyle="1" w:styleId="SectionNumber">
     <w:name w:val="Section Number"/>
     <w:basedOn w:val="BodyTextChar"/>
   </w:style>
-  <w:style w:styleId="FootnoteReference" w:type="character">
+  <w:style w:type="character" w:styleId="FootnoteReference">
     <w:name w:val="Footnote Reference"/>
     <w:basedOn w:val="BodyTextChar"/>
     <w:rPr>
       <w:vertAlign w:val="superscript"/>
     </w:rPr>
   </w:style>
-  <w:style w:styleId="Hyperlink" w:type="character">
+  <w:style w:type="character" w:styleId="Hyperlink">
     <w:name w:val="Hyperlink"/>
     <w:basedOn w:val="BodyTextChar"/>
     <w:rPr>
-      <w:color w:themeColor="accent1" w:val="4F81BD"/>
-    </w:rPr>
-  </w:style>
-  <w:style w:styleId="TOCHeading" w:type="paragraph">
+      <w:color w:val="4F81BD" w:themeColor="accent1"/>
+    </w:rPr>
+  </w:style>
+  <w:style w:type="paragraph" w:styleId="TOCHeading">
     <w:name w:val="TOC Heading"/>
     <w:basedOn w:val="Heading1"/>
     <w:next w:val="BodyText"/>
@@ -1761,10 +1775,10 @@
       <w:outlineLvl w:val="9"/>
     </w:pPr>
     <w:rPr>
-      <w:rFonts w:asciiTheme="majorHAnsi" w:cstheme="majorBidi" w:eastAsiaTheme="majorEastAsia" w:hAnsiTheme="majorHAnsi"/>
+      <w:rFonts w:asciiTheme="majorHAnsi" w:eastAsiaTheme="majorEastAsia" w:hAnsiTheme="majorHAnsi" w:cstheme="majorBidi"/>
       <w:b w:val="0"/>
       <w:bCs w:val="0"/>
-      <w:color w:themeColor="accent1" w:themeShade="BF" w:val="365F91"/>
+      <w:color w:val="365F91" w:themeColor="accent1" w:themeShade="BF"/>
     </w:rPr>
   </w:style>
   <w:style w:type="paragraph" w:customStyle="1" w:styleId="SourceCode">

</xml_diff>